<commit_message>
fix(ag): use keywords in pdf header, add CalculatedFormQuestion
</commit_message>
<xml_diff>
--- a/document-merge-service/kt_ag/templatefiles/form.docx
+++ b/document-merge-service/kt_ag/templatefiles/form.docx
@@ -1,6 +1,6 @@
 
 <file path=word/document.xml><?xml version="1.0" encoding="utf-8"?>
-<w:document xmlns:o="urn:schemas-microsoft-com:office:office" xmlns:r="http://schemas.openxmlformats.org/officeDocument/2006/relationships" xmlns:v="urn:schemas-microsoft-com:vml" xmlns:w="http://schemas.openxmlformats.org/wordprocessingml/2006/main" xmlns:w10="urn:schemas-microsoft-com:office:word" xmlns:wp="http://schemas.openxmlformats.org/drawingml/2006/wordprocessingDrawing" xmlns:wps="http://schemas.microsoft.com/office/word/2010/wordprocessingShape" xmlns:wpg="http://schemas.microsoft.com/office/word/2010/wordprocessingGroup" xmlns:mc="http://schemas.openxmlformats.org/markup-compatibility/2006" xmlns:wp14="http://schemas.microsoft.com/office/word/2010/wordprocessingDrawing" xmlns:w14="http://schemas.microsoft.com/office/word/2010/wordml" xmlns:w15="http://schemas.microsoft.com/office/word/2012/wordml" mc:Ignorable="w14 wp14 w15">
+<w:document xmlns:o="urn:schemas-microsoft-com:office:office" xmlns:r="http://schemas.openxmlformats.org/officeDocument/2006/relationships" xmlns:v="urn:schemas-microsoft-com:vml" xmlns:w="http://schemas.openxmlformats.org/wordprocessingml/2006/main" xmlns:w10="urn:schemas-microsoft-com:office:word" xmlns:wp="http://schemas.openxmlformats.org/drawingml/2006/wordprocessingDrawing" xmlns:pic="http://schemas.openxmlformats.org/drawingml/2006/picture" xmlns:wps="http://schemas.microsoft.com/office/word/2010/wordprocessingShape" xmlns:wpg="http://schemas.microsoft.com/office/word/2010/wordprocessingGroup" xmlns:mc="http://schemas.openxmlformats.org/markup-compatibility/2006" xmlns:wp14="http://schemas.microsoft.com/office/word/2010/wordprocessingDrawing" xmlns:w14="http://schemas.microsoft.com/office/word/2010/wordml" xmlns:w15="http://schemas.microsoft.com/office/word/2012/wordml" mc:Ignorable="w14 wp14 w15">
   <w:body>
     <w:p>
       <w:pPr>
@@ -56,10 +56,10 @@
           </w:tcPr>
           <w:p>
             <w:pPr>
-              <w:pStyle w:val="TableHeading"/>
+              <w:pStyle w:val="Tabellenberschriftuser"/>
               <w:numPr>
                 <w:ilvl w:val="2"/>
-                <w:numId w:val="5"/>
+                <w:numId w:val="4"/>
               </w:numPr>
               <w:rPr/>
             </w:pPr>
@@ -80,10 +80,10 @@
           </w:tcPr>
           <w:p>
             <w:pPr>
-              <w:pStyle w:val="TableHeading"/>
+              <w:pStyle w:val="Tabellenberschriftuser"/>
               <w:numPr>
                 <w:ilvl w:val="2"/>
-                <w:numId w:val="5"/>
+                <w:numId w:val="4"/>
               </w:numPr>
               <w:rPr/>
             </w:pPr>
@@ -103,7 +103,7 @@
           </w:tcPr>
           <w:p>
             <w:pPr>
-              <w:pStyle w:val="TableContents"/>
+              <w:pStyle w:val="Tabelleninhaltuser"/>
               <w:rPr/>
             </w:pPr>
             <w:r>
@@ -123,7 +123,7 @@
           </w:tcPr>
           <w:p>
             <w:pPr>
-              <w:pStyle w:val="TableContents"/>
+              <w:pStyle w:val="Tabelleninhaltuser"/>
               <w:rPr/>
             </w:pPr>
             <w:r>
@@ -133,7 +133,7 @@
           </w:p>
           <w:p>
             <w:pPr>
-              <w:pStyle w:val="TableContents"/>
+              <w:pStyle w:val="Tabelleninhaltuser"/>
               <w:rPr/>
             </w:pPr>
             <w:r>
@@ -152,10 +152,10 @@
           </w:tcPr>
           <w:p>
             <w:pPr>
-              <w:pStyle w:val="TableHeading"/>
+              <w:pStyle w:val="Tabellenberschriftuser"/>
               <w:numPr>
                 <w:ilvl w:val="3"/>
-                <w:numId w:val="5"/>
+                <w:numId w:val="4"/>
               </w:numPr>
               <w:rPr/>
             </w:pPr>
@@ -176,10 +176,10 @@
           </w:tcPr>
           <w:p>
             <w:pPr>
-              <w:pStyle w:val="TableHeading"/>
+              <w:pStyle w:val="Tabellenberschriftuser"/>
               <w:numPr>
                 <w:ilvl w:val="3"/>
-                <w:numId w:val="5"/>
+                <w:numId w:val="4"/>
               </w:numPr>
               <w:rPr/>
             </w:pPr>
@@ -199,10 +199,10 @@
           </w:tcPr>
           <w:p>
             <w:pPr>
-              <w:pStyle w:val="TableContents"/>
+              <w:pStyle w:val="Tabelleninhaltuser"/>
               <w:numPr>
                 <w:ilvl w:val="3"/>
-                <w:numId w:val="5"/>
+                <w:numId w:val="4"/>
               </w:numPr>
               <w:rPr/>
             </w:pPr>
@@ -237,10 +237,10 @@
           </w:tcPr>
           <w:p>
             <w:pPr>
-              <w:pStyle w:val="TableContents"/>
+              <w:pStyle w:val="Tabelleninhaltuser"/>
               <w:numPr>
                 <w:ilvl w:val="3"/>
-                <w:numId w:val="5"/>
+                <w:numId w:val="4"/>
               </w:numPr>
               <w:rPr/>
             </w:pPr>
@@ -251,10 +251,10 @@
           </w:p>
           <w:p>
             <w:pPr>
-              <w:pStyle w:val="TableContents"/>
+              <w:pStyle w:val="Tabelleninhaltuser"/>
               <w:numPr>
                 <w:ilvl w:val="3"/>
-                <w:numId w:val="5"/>
+                <w:numId w:val="4"/>
               </w:numPr>
               <w:rPr/>
             </w:pPr>
@@ -274,10 +274,10 @@
           </w:tcPr>
           <w:p>
             <w:pPr>
-              <w:pStyle w:val="TableHeading"/>
+              <w:pStyle w:val="Tabellenberschriftuser"/>
               <w:numPr>
                 <w:ilvl w:val="2"/>
-                <w:numId w:val="5"/>
+                <w:numId w:val="4"/>
               </w:numPr>
               <w:rPr/>
             </w:pPr>
@@ -298,10 +298,10 @@
           </w:tcPr>
           <w:p>
             <w:pPr>
-              <w:pStyle w:val="TableHeading"/>
+              <w:pStyle w:val="Tabellenberschriftuser"/>
               <w:numPr>
                 <w:ilvl w:val="2"/>
-                <w:numId w:val="5"/>
+                <w:numId w:val="4"/>
               </w:numPr>
               <w:rPr/>
             </w:pPr>
@@ -321,10 +321,10 @@
           </w:tcPr>
           <w:p>
             <w:pPr>
-              <w:pStyle w:val="TableContents"/>
+              <w:pStyle w:val="Tabelleninhaltuser"/>
               <w:numPr>
                 <w:ilvl w:val="2"/>
-                <w:numId w:val="5"/>
+                <w:numId w:val="4"/>
               </w:numPr>
               <w:rPr/>
             </w:pPr>
@@ -345,10 +345,10 @@
           </w:tcPr>
           <w:p>
             <w:pPr>
-              <w:pStyle w:val="TableContents"/>
+              <w:pStyle w:val="Tabelleninhaltuser"/>
               <w:numPr>
                 <w:ilvl w:val="3"/>
-                <w:numId w:val="5"/>
+                <w:numId w:val="4"/>
               </w:numPr>
               <w:rPr/>
             </w:pPr>
@@ -359,10 +359,10 @@
           </w:p>
           <w:p>
             <w:pPr>
-              <w:pStyle w:val="TableContents"/>
+              <w:pStyle w:val="Tabelleninhaltuser"/>
               <w:numPr>
                 <w:ilvl w:val="3"/>
-                <w:numId w:val="5"/>
+                <w:numId w:val="4"/>
               </w:numPr>
               <w:rPr/>
             </w:pPr>
@@ -382,10 +382,10 @@
           </w:tcPr>
           <w:p>
             <w:pPr>
-              <w:pStyle w:val="TableHeading"/>
+              <w:pStyle w:val="Tabellenberschriftuser"/>
               <w:numPr>
                 <w:ilvl w:val="2"/>
-                <w:numId w:val="5"/>
+                <w:numId w:val="4"/>
               </w:numPr>
               <w:rPr/>
             </w:pPr>
@@ -406,10 +406,10 @@
           </w:tcPr>
           <w:p>
             <w:pPr>
-              <w:pStyle w:val="TableHeading"/>
+              <w:pStyle w:val="Tabellenberschriftuser"/>
               <w:numPr>
                 <w:ilvl w:val="2"/>
-                <w:numId w:val="5"/>
+                <w:numId w:val="4"/>
               </w:numPr>
               <w:rPr/>
             </w:pPr>
@@ -429,10 +429,10 @@
           </w:tcPr>
           <w:p>
             <w:pPr>
-              <w:pStyle w:val="TableContents"/>
+              <w:pStyle w:val="Tabelleninhaltuser"/>
               <w:numPr>
                 <w:ilvl w:val="3"/>
-                <w:numId w:val="5"/>
+                <w:numId w:val="4"/>
               </w:numPr>
               <w:rPr/>
             </w:pPr>
@@ -453,10 +453,10 @@
           </w:tcPr>
           <w:p>
             <w:pPr>
-              <w:pStyle w:val="TableContents"/>
+              <w:pStyle w:val="Tabelleninhaltuser"/>
               <w:numPr>
                 <w:ilvl w:val="0"/>
-                <w:numId w:val="5"/>
+                <w:numId w:val="4"/>
               </w:numPr>
               <w:rPr/>
             </w:pPr>
@@ -476,10 +476,10 @@
           </w:tcPr>
           <w:p>
             <w:pPr>
-              <w:pStyle w:val="TableHeading"/>
+              <w:pStyle w:val="Tabellenberschriftuser"/>
               <w:numPr>
                 <w:ilvl w:val="2"/>
-                <w:numId w:val="5"/>
+                <w:numId w:val="4"/>
               </w:numPr>
               <w:rPr/>
             </w:pPr>
@@ -500,7 +500,7 @@
           </w:tcPr>
           <w:p>
             <w:pPr>
-              <w:pStyle w:val="TableHeading"/>
+              <w:pStyle w:val="Tabellenberschriftuser"/>
               <w:rPr/>
             </w:pPr>
             <w:r>
@@ -519,10 +519,10 @@
           </w:tcPr>
           <w:p>
             <w:pPr>
-              <w:pStyle w:val="TableContents"/>
+              <w:pStyle w:val="Tabelleninhaltuser"/>
               <w:numPr>
                 <w:ilvl w:val="3"/>
-                <w:numId w:val="5"/>
+                <w:numId w:val="4"/>
               </w:numPr>
               <w:rPr/>
             </w:pPr>
@@ -543,10 +543,10 @@
           </w:tcPr>
           <w:p>
             <w:pPr>
-              <w:pStyle w:val="TableContents"/>
+              <w:pStyle w:val="Tabelleninhaltuser"/>
               <w:numPr>
                 <w:ilvl w:val="2"/>
-                <w:numId w:val="5"/>
+                <w:numId w:val="4"/>
               </w:numPr>
               <w:rPr/>
             </w:pPr>
@@ -746,7 +746,7 @@
         <w:pStyle w:val="Heading1"/>
         <w:numPr>
           <w:ilvl w:val="0"/>
-          <w:numId w:val="3"/>
+          <w:numId w:val="2"/>
         </w:numPr>
         <w:rPr>
           <w:rFonts w:ascii="Arial" w:hAnsi="Arial"/>
@@ -1090,7 +1090,7 @@
               <w:widowControl w:val="false"/>
               <w:numPr>
                 <w:ilvl w:val="2"/>
-                <w:numId w:val="4"/>
+                <w:numId w:val="3"/>
               </w:numPr>
               <w:suppressAutoHyphens w:val="true"/>
               <w:spacing w:before="0" w:after="0"/>
@@ -1305,6 +1305,51 @@
                 <w:sz w:val="18"/>
                 <w:szCs w:val="18"/>
                 <w:lang w:val="fr-CH"/>
+              </w:rPr>
+              <w:t>{{ subSection.value | emptystring }}</w:t>
+            </w:r>
+          </w:p>
+          <w:p>
+            <w:pPr>
+              <w:pStyle w:val="Normal"/>
+              <w:widowControl w:val="false"/>
+              <w:suppressAutoHyphens w:val="true"/>
+              <w:spacing w:before="0" w:after="0"/>
+              <w:jc w:val="left"/>
+              <w:rPr>
+                <w:sz w:val="20"/>
+              </w:rPr>
+            </w:pPr>
+            <w:r>
+              <w:rPr>
+                <w:rFonts w:eastAsia="Noto Sans CJK SC Regular" w:cs="Arial" w:ascii="Liberation Sans" w:hAnsi="Liberation Sans"/>
+                <w:kern w:val="2"/>
+                <w:sz w:val="18"/>
+                <w:szCs w:val="18"/>
+                <w:lang w:val="fr-CH" w:eastAsia="zh-CN" w:bidi="hi-IN"/>
+              </w:rPr>
+              <w:t>{%p elif subSection.type == "CalculatedFloatQuestion" %}</w:t>
+            </w:r>
+          </w:p>
+          <w:p>
+            <w:pPr>
+              <w:pStyle w:val="Normal"/>
+              <w:widowControl w:val="false"/>
+              <w:suppressAutoHyphens w:val="true"/>
+              <w:spacing w:before="0" w:after="0"/>
+              <w:jc w:val="left"/>
+              <w:rPr>
+                <w:sz w:val="20"/>
+              </w:rPr>
+            </w:pPr>
+            <w:r>
+              <w:rPr>
+                <w:rFonts w:eastAsia="Noto Sans CJK SC Regular" w:cs="Arial" w:ascii="Liberation Sans" w:hAnsi="Liberation Sans"/>
+                <w:color w:val="auto"/>
+                <w:kern w:val="2"/>
+                <w:sz w:val="18"/>
+                <w:szCs w:val="18"/>
+                <w:lang w:val="fr-CH" w:eastAsia="zh-CN" w:bidi="hi-IN"/>
               </w:rPr>
               <w:t>{{ subSection.value | emptystring }}</w:t>
             </w:r>
@@ -1405,6 +1450,7 @@
                           <a:prstGeom prst="rect">
                             <a:avLst/>
                           </a:prstGeom>
+                          <a:noFill/>
                         </pic:spPr>
                       </pic:pic>
                     </a:graphicData>
@@ -1455,6 +1501,7 @@
                           <a:prstGeom prst="rect">
                             <a:avLst/>
                           </a:prstGeom>
+                          <a:noFill/>
                         </pic:spPr>
                       </pic:pic>
                     </a:graphicData>
@@ -1592,6 +1639,7 @@
                           <a:prstGeom prst="rect">
                             <a:avLst/>
                           </a:prstGeom>
+                          <a:noFill/>
                         </pic:spPr>
                       </pic:pic>
                     </a:graphicData>
@@ -1642,6 +1690,7 @@
                           <a:prstGeom prst="rect">
                             <a:avLst/>
                           </a:prstGeom>
+                          <a:noFill/>
                         </pic:spPr>
                       </pic:pic>
                     </a:graphicData>
@@ -2218,7 +2267,7 @@
         <w:pStyle w:val="Heading2"/>
         <w:numPr>
           <w:ilvl w:val="1"/>
-          <w:numId w:val="3"/>
+          <w:numId w:val="2"/>
         </w:numPr>
         <w:rPr>
           <w:rFonts w:ascii="Arial" w:hAnsi="Arial"/>
@@ -2495,7 +2544,7 @@
               <w:widowControl w:val="false"/>
               <w:numPr>
                 <w:ilvl w:val="2"/>
-                <w:numId w:val="4"/>
+                <w:numId w:val="3"/>
               </w:numPr>
               <w:suppressAutoHyphens w:val="true"/>
               <w:spacing w:before="0" w:after="0"/>
@@ -2683,6 +2732,50 @@
                 <w:sz w:val="18"/>
                 <w:szCs w:val="18"/>
                 <w:lang w:val="fr-CH"/>
+              </w:rPr>
+              <w:t>{{ question.value | emptystring }}</w:t>
+            </w:r>
+          </w:p>
+          <w:p>
+            <w:pPr>
+              <w:pStyle w:val="Normal"/>
+              <w:widowControl w:val="false"/>
+              <w:suppressAutoHyphens w:val="true"/>
+              <w:spacing w:before="0" w:after="0"/>
+              <w:jc w:val="left"/>
+              <w:rPr>
+                <w:sz w:val="20"/>
+              </w:rPr>
+            </w:pPr>
+            <w:r>
+              <w:rPr>
+                <w:rFonts w:eastAsia="Noto Sans CJK SC Regular" w:cs="Arial" w:ascii="Liberation Sans" w:hAnsi="Liberation Sans"/>
+                <w:kern w:val="2"/>
+                <w:sz w:val="18"/>
+                <w:szCs w:val="18"/>
+                <w:lang w:val="fr-CH" w:eastAsia="zh-CN" w:bidi="hi-IN"/>
+              </w:rPr>
+              <w:t>{%p elif question.type == "CalculatedFloatQuestion" %}</w:t>
+            </w:r>
+          </w:p>
+          <w:p>
+            <w:pPr>
+              <w:pStyle w:val="Normal"/>
+              <w:widowControl w:val="false"/>
+              <w:suppressAutoHyphens w:val="true"/>
+              <w:spacing w:before="0" w:after="0"/>
+              <w:jc w:val="left"/>
+              <w:rPr>
+                <w:sz w:val="20"/>
+              </w:rPr>
+            </w:pPr>
+            <w:r>
+              <w:rPr>
+                <w:rFonts w:eastAsia="Noto Sans CJK SC Regular" w:cs="Arial" w:ascii="Liberation Sans" w:hAnsi="Liberation Sans"/>
+                <w:kern w:val="2"/>
+                <w:sz w:val="18"/>
+                <w:szCs w:val="18"/>
+                <w:lang w:val="fr-CH" w:eastAsia="zh-CN" w:bidi="hi-IN"/>
               </w:rPr>
               <w:t>{{ question.value | emptystring }}</w:t>
             </w:r>
@@ -2780,6 +2873,7 @@
                           <a:prstGeom prst="rect">
                             <a:avLst/>
                           </a:prstGeom>
+                          <a:noFill/>
                         </pic:spPr>
                       </pic:pic>
                     </a:graphicData>
@@ -2829,6 +2923,7 @@
                           <a:prstGeom prst="rect">
                             <a:avLst/>
                           </a:prstGeom>
+                          <a:noFill/>
                         </pic:spPr>
                       </pic:pic>
                     </a:graphicData>
@@ -2961,6 +3056,7 @@
                           <a:prstGeom prst="rect">
                             <a:avLst/>
                           </a:prstGeom>
+                          <a:noFill/>
                         </pic:spPr>
                       </pic:pic>
                     </a:graphicData>
@@ -3010,6 +3106,7 @@
                           <a:prstGeom prst="rect">
                             <a:avLst/>
                           </a:prstGeom>
+                          <a:noFill/>
                         </pic:spPr>
                       </pic:pic>
                     </a:graphicData>
@@ -3746,6 +3843,7 @@
                           <a:prstGeom prst="rect">
                             <a:avLst/>
                           </a:prstGeom>
+                          <a:noFill/>
                         </pic:spPr>
                       </pic:pic>
                     </a:graphicData>
@@ -3795,6 +3893,7 @@
                           <a:prstGeom prst="rect">
                             <a:avLst/>
                           </a:prstGeom>
+                          <a:noFill/>
                         </pic:spPr>
                       </pic:pic>
                     </a:graphicData>
@@ -3957,7 +4056,7 @@
 </file>
 
 <file path=word/footer1.xml><?xml version="1.0" encoding="utf-8"?>
-<w:ftr xmlns:o="urn:schemas-microsoft-com:office:office" xmlns:r="http://schemas.openxmlformats.org/officeDocument/2006/relationships" xmlns:v="urn:schemas-microsoft-com:vml" xmlns:w="http://schemas.openxmlformats.org/wordprocessingml/2006/main" xmlns:w10="urn:schemas-microsoft-com:office:word" xmlns:wp="http://schemas.openxmlformats.org/drawingml/2006/wordprocessingDrawing" xmlns:wps="http://schemas.microsoft.com/office/word/2010/wordprocessingShape" xmlns:wpg="http://schemas.microsoft.com/office/word/2010/wordprocessingGroup" xmlns:mc="http://schemas.openxmlformats.org/markup-compatibility/2006" xmlns:wp14="http://schemas.microsoft.com/office/word/2010/wordprocessingDrawing" xmlns:w14="http://schemas.microsoft.com/office/word/2010/wordml" xmlns:w15="http://schemas.microsoft.com/office/word/2012/wordml" mc:Ignorable="w14 wp14 w15">
+<w:ftr xmlns:o="urn:schemas-microsoft-com:office:office" xmlns:r="http://schemas.openxmlformats.org/officeDocument/2006/relationships" xmlns:v="urn:schemas-microsoft-com:vml" xmlns:w="http://schemas.openxmlformats.org/wordprocessingml/2006/main" xmlns:w10="urn:schemas-microsoft-com:office:word" xmlns:wp="http://schemas.openxmlformats.org/drawingml/2006/wordprocessingDrawing" xmlns:pic="http://schemas.openxmlformats.org/drawingml/2006/picture" xmlns:wps="http://schemas.microsoft.com/office/word/2010/wordprocessingShape" xmlns:wpg="http://schemas.microsoft.com/office/word/2010/wordprocessingGroup" xmlns:mc="http://schemas.openxmlformats.org/markup-compatibility/2006" xmlns:wp14="http://schemas.microsoft.com/office/word/2010/wordprocessingDrawing" xmlns:w14="http://schemas.microsoft.com/office/word/2010/wordml" xmlns:w15="http://schemas.microsoft.com/office/word/2012/wordml" mc:Ignorable="w14 wp14 w15">
   <w:p>
     <w:pPr>
       <w:pStyle w:val="Footer"/>
@@ -3971,7 +4070,7 @@
 </file>
 
 <file path=word/footer2.xml><?xml version="1.0" encoding="utf-8"?>
-<w:ftr xmlns:o="urn:schemas-microsoft-com:office:office" xmlns:r="http://schemas.openxmlformats.org/officeDocument/2006/relationships" xmlns:v="urn:schemas-microsoft-com:vml" xmlns:w="http://schemas.openxmlformats.org/wordprocessingml/2006/main" xmlns:w10="urn:schemas-microsoft-com:office:word" xmlns:wp="http://schemas.openxmlformats.org/drawingml/2006/wordprocessingDrawing" xmlns:wps="http://schemas.microsoft.com/office/word/2010/wordprocessingShape" xmlns:wpg="http://schemas.microsoft.com/office/word/2010/wordprocessingGroup" xmlns:mc="http://schemas.openxmlformats.org/markup-compatibility/2006" xmlns:wp14="http://schemas.microsoft.com/office/word/2010/wordprocessingDrawing" xmlns:w14="http://schemas.microsoft.com/office/word/2010/wordml" xmlns:w15="http://schemas.microsoft.com/office/word/2012/wordml" mc:Ignorable="w14 wp14 w15">
+<w:ftr xmlns:o="urn:schemas-microsoft-com:office:office" xmlns:r="http://schemas.openxmlformats.org/officeDocument/2006/relationships" xmlns:v="urn:schemas-microsoft-com:vml" xmlns:w="http://schemas.openxmlformats.org/wordprocessingml/2006/main" xmlns:w10="urn:schemas-microsoft-com:office:word" xmlns:wp="http://schemas.openxmlformats.org/drawingml/2006/wordprocessingDrawing" xmlns:pic="http://schemas.openxmlformats.org/drawingml/2006/picture" xmlns:wps="http://schemas.microsoft.com/office/word/2010/wordprocessingShape" xmlns:wpg="http://schemas.microsoft.com/office/word/2010/wordprocessingGroup" xmlns:mc="http://schemas.openxmlformats.org/markup-compatibility/2006" xmlns:wp14="http://schemas.microsoft.com/office/word/2010/wordprocessingDrawing" xmlns:w14="http://schemas.microsoft.com/office/word/2010/wordml" xmlns:w15="http://schemas.microsoft.com/office/word/2012/wordml" mc:Ignorable="w14 wp14 w15">
   <w:p>
     <w:pPr>
       <w:pStyle w:val="Footer"/>
@@ -3995,6 +4094,34 @@
     </w:r>
     <w:r>
       <w:rPr/>
+      <w:t>3</w:t>
+    </w:r>
+    <w:r>
+      <w:rPr/>
+      <w:fldChar w:fldCharType="end"/>
+    </w:r>
+    <w:r>
+      <w:rPr/>
+      <w:t xml:space="preserve"> </w:t>
+    </w:r>
+    <w:r>
+      <w:rPr/>
+      <w:t xml:space="preserve">/ </w:t>
+    </w:r>
+    <w:r>
+      <w:rPr/>
+      <w:fldChar w:fldCharType="begin"/>
+    </w:r>
+    <w:r>
+      <w:rPr/>
+      <w:instrText xml:space="preserve"> NUMPAGES </w:instrText>
+    </w:r>
+    <w:r>
+      <w:rPr/>
+      <w:fldChar w:fldCharType="separate"/>
+    </w:r>
+    <w:r>
+      <w:rPr/>
       <w:t>4</w:t>
     </w:r>
     <w:r>
@@ -4003,51 +4130,15 @@
     </w:r>
     <w:r>
       <w:rPr/>
-      <w:t xml:space="preserve"> </w:t>
-    </w:r>
-    <w:r>
-      <w:rPr/>
-      <w:t xml:space="preserve">/ </w:t>
-    </w:r>
-    <w:r>
-      <w:rPr/>
-      <w:fldChar w:fldCharType="begin"/>
-    </w:r>
-    <w:r>
-      <w:rPr/>
-      <w:instrText xml:space="preserve"> NUMPAGES </w:instrText>
-    </w:r>
-    <w:r>
-      <w:rPr/>
-      <w:fldChar w:fldCharType="separate"/>
-    </w:r>
-    <w:r>
-      <w:rPr/>
-      <w:t>4</w:t>
-    </w:r>
-    <w:r>
-      <w:rPr/>
-      <w:fldChar w:fldCharType="end"/>
-    </w:r>
-    <w:r>
-      <w:rPr/>
       <w:tab/>
-      <w:t>{{ caseType }} {{ doss</w:t>
-    </w:r>
-    <w:r>
-      <w:rPr/>
-      <w:t>i</w:t>
-    </w:r>
-    <w:r>
-      <w:rPr/>
-      <w:t>erNr }}</w:t>
+      <w:t>{{ caseType }} {{ dossierNr }}</w:t>
     </w:r>
   </w:p>
 </w:ftr>
 </file>
 
 <file path=word/footer3.xml><?xml version="1.0" encoding="utf-8"?>
-<w:ftr xmlns:o="urn:schemas-microsoft-com:office:office" xmlns:r="http://schemas.openxmlformats.org/officeDocument/2006/relationships" xmlns:v="urn:schemas-microsoft-com:vml" xmlns:w="http://schemas.openxmlformats.org/wordprocessingml/2006/main" xmlns:w10="urn:schemas-microsoft-com:office:word" xmlns:wp="http://schemas.openxmlformats.org/drawingml/2006/wordprocessingDrawing" xmlns:wps="http://schemas.microsoft.com/office/word/2010/wordprocessingShape" xmlns:wpg="http://schemas.microsoft.com/office/word/2010/wordprocessingGroup" xmlns:mc="http://schemas.openxmlformats.org/markup-compatibility/2006" xmlns:wp14="http://schemas.microsoft.com/office/word/2010/wordprocessingDrawing" xmlns:w14="http://schemas.microsoft.com/office/word/2010/wordml" xmlns:w15="http://schemas.microsoft.com/office/word/2012/wordml" mc:Ignorable="w14 wp14 w15">
+<w:ftr xmlns:o="urn:schemas-microsoft-com:office:office" xmlns:r="http://schemas.openxmlformats.org/officeDocument/2006/relationships" xmlns:v="urn:schemas-microsoft-com:vml" xmlns:w="http://schemas.openxmlformats.org/wordprocessingml/2006/main" xmlns:w10="urn:schemas-microsoft-com:office:word" xmlns:wp="http://schemas.openxmlformats.org/drawingml/2006/wordprocessingDrawing" xmlns:pic="http://schemas.openxmlformats.org/drawingml/2006/picture" xmlns:wps="http://schemas.microsoft.com/office/word/2010/wordprocessingShape" xmlns:wpg="http://schemas.microsoft.com/office/word/2010/wordprocessingGroup" xmlns:mc="http://schemas.openxmlformats.org/markup-compatibility/2006" xmlns:wp14="http://schemas.microsoft.com/office/word/2010/wordprocessingDrawing" xmlns:w14="http://schemas.microsoft.com/office/word/2010/wordml" xmlns:w15="http://schemas.microsoft.com/office/word/2012/wordml" mc:Ignorable="w14 wp14 w15">
   <w:p>
     <w:pPr>
       <w:pStyle w:val="Footer"/>
@@ -4071,6 +4162,34 @@
     </w:r>
     <w:r>
       <w:rPr/>
+      <w:t>3</w:t>
+    </w:r>
+    <w:r>
+      <w:rPr/>
+      <w:fldChar w:fldCharType="end"/>
+    </w:r>
+    <w:r>
+      <w:rPr/>
+      <w:t xml:space="preserve"> </w:t>
+    </w:r>
+    <w:r>
+      <w:rPr/>
+      <w:t xml:space="preserve">/ </w:t>
+    </w:r>
+    <w:r>
+      <w:rPr/>
+      <w:fldChar w:fldCharType="begin"/>
+    </w:r>
+    <w:r>
+      <w:rPr/>
+      <w:instrText xml:space="preserve"> NUMPAGES </w:instrText>
+    </w:r>
+    <w:r>
+      <w:rPr/>
+      <w:fldChar w:fldCharType="separate"/>
+    </w:r>
+    <w:r>
+      <w:rPr/>
       <w:t>4</w:t>
     </w:r>
     <w:r>
@@ -4079,51 +4198,15 @@
     </w:r>
     <w:r>
       <w:rPr/>
-      <w:t xml:space="preserve"> </w:t>
-    </w:r>
-    <w:r>
-      <w:rPr/>
-      <w:t xml:space="preserve">/ </w:t>
-    </w:r>
-    <w:r>
-      <w:rPr/>
-      <w:fldChar w:fldCharType="begin"/>
-    </w:r>
-    <w:r>
-      <w:rPr/>
-      <w:instrText xml:space="preserve"> NUMPAGES </w:instrText>
-    </w:r>
-    <w:r>
-      <w:rPr/>
-      <w:fldChar w:fldCharType="separate"/>
-    </w:r>
-    <w:r>
-      <w:rPr/>
-      <w:t>4</w:t>
-    </w:r>
-    <w:r>
-      <w:rPr/>
-      <w:fldChar w:fldCharType="end"/>
-    </w:r>
-    <w:r>
-      <w:rPr/>
       <w:tab/>
-      <w:t>{{ caseType }} {{ doss</w:t>
-    </w:r>
-    <w:r>
-      <w:rPr/>
-      <w:t>i</w:t>
-    </w:r>
-    <w:r>
-      <w:rPr/>
-      <w:t>erNr }}</w:t>
+      <w:t>{{ caseType }} {{ dossierNr }}</w:t>
     </w:r>
   </w:p>
 </w:ftr>
 </file>
 
 <file path=word/header1.xml><?xml version="1.0" encoding="utf-8"?>
-<w:hdr xmlns:o="urn:schemas-microsoft-com:office:office" xmlns:r="http://schemas.openxmlformats.org/officeDocument/2006/relationships" xmlns:v="urn:schemas-microsoft-com:vml" xmlns:w="http://schemas.openxmlformats.org/wordprocessingml/2006/main" xmlns:w10="urn:schemas-microsoft-com:office:word" xmlns:wp="http://schemas.openxmlformats.org/drawingml/2006/wordprocessingDrawing" xmlns:wps="http://schemas.microsoft.com/office/word/2010/wordprocessingShape" xmlns:wpg="http://schemas.microsoft.com/office/word/2010/wordprocessingGroup" xmlns:mc="http://schemas.openxmlformats.org/markup-compatibility/2006" xmlns:wp14="http://schemas.microsoft.com/office/word/2010/wordprocessingDrawing" xmlns:w14="http://schemas.microsoft.com/office/word/2010/wordml" xmlns:w15="http://schemas.microsoft.com/office/word/2012/wordml" mc:Ignorable="w14 wp14 w15">
+<w:hdr xmlns:o="urn:schemas-microsoft-com:office:office" xmlns:r="http://schemas.openxmlformats.org/officeDocument/2006/relationships" xmlns:v="urn:schemas-microsoft-com:vml" xmlns:w="http://schemas.openxmlformats.org/wordprocessingml/2006/main" xmlns:w10="urn:schemas-microsoft-com:office:word" xmlns:wp="http://schemas.openxmlformats.org/drawingml/2006/wordprocessingDrawing" xmlns:pic="http://schemas.openxmlformats.org/drawingml/2006/picture" xmlns:wps="http://schemas.microsoft.com/office/word/2010/wordprocessingShape" xmlns:wpg="http://schemas.microsoft.com/office/word/2010/wordprocessingGroup" xmlns:mc="http://schemas.openxmlformats.org/markup-compatibility/2006" xmlns:wp14="http://schemas.microsoft.com/office/word/2010/wordprocessingDrawing" xmlns:w14="http://schemas.microsoft.com/office/word/2010/wordml" xmlns:w15="http://schemas.microsoft.com/office/word/2012/wordml" mc:Ignorable="w14 wp14 w15">
   <w:p>
     <w:pPr>
       <w:pStyle w:val="Header"/>
@@ -4137,7 +4220,7 @@
 </file>
 
 <file path=word/header2.xml><?xml version="1.0" encoding="utf-8"?>
-<w:hdr xmlns:o="urn:schemas-microsoft-com:office:office" xmlns:r="http://schemas.openxmlformats.org/officeDocument/2006/relationships" xmlns:v="urn:schemas-microsoft-com:vml" xmlns:w="http://schemas.openxmlformats.org/wordprocessingml/2006/main" xmlns:w10="urn:schemas-microsoft-com:office:word" xmlns:wp="http://schemas.openxmlformats.org/drawingml/2006/wordprocessingDrawing" xmlns:wps="http://schemas.microsoft.com/office/word/2010/wordprocessingShape" xmlns:wpg="http://schemas.microsoft.com/office/word/2010/wordprocessingGroup" xmlns:mc="http://schemas.openxmlformats.org/markup-compatibility/2006" xmlns:wp14="http://schemas.microsoft.com/office/word/2010/wordprocessingDrawing" xmlns:w14="http://schemas.microsoft.com/office/word/2010/wordml" xmlns:w15="http://schemas.microsoft.com/office/word/2012/wordml" mc:Ignorable="w14 wp14 w15">
+<w:hdr xmlns:o="urn:schemas-microsoft-com:office:office" xmlns:r="http://schemas.openxmlformats.org/officeDocument/2006/relationships" xmlns:v="urn:schemas-microsoft-com:vml" xmlns:w="http://schemas.openxmlformats.org/wordprocessingml/2006/main" xmlns:w10="urn:schemas-microsoft-com:office:word" xmlns:wp="http://schemas.openxmlformats.org/drawingml/2006/wordprocessingDrawing" xmlns:pic="http://schemas.openxmlformats.org/drawingml/2006/picture" xmlns:wps="http://schemas.microsoft.com/office/word/2010/wordprocessingShape" xmlns:wpg="http://schemas.microsoft.com/office/word/2010/wordprocessingGroup" xmlns:mc="http://schemas.openxmlformats.org/markup-compatibility/2006" xmlns:wp14="http://schemas.microsoft.com/office/word/2010/wordprocessingDrawing" xmlns:w14="http://schemas.microsoft.com/office/word/2010/wordml" xmlns:w15="http://schemas.microsoft.com/office/word/2012/wordml" mc:Ignorable="w14 wp14 w15">
   <w:p>
     <w:pPr>
       <w:pStyle w:val="Header"/>
@@ -4151,7 +4234,7 @@
     <w:r>
       <w:rPr/>
       <w:drawing>
-        <wp:anchor behindDoc="1" distT="0" distB="0" distL="0" distR="0" simplePos="0" locked="0" layoutInCell="0" allowOverlap="1" relativeHeight="14">
+        <wp:anchor behindDoc="1" distT="0" distB="0" distL="0" distR="0" simplePos="0" locked="0" layoutInCell="0" allowOverlap="1" relativeHeight="15">
           <wp:simplePos x="0" y="0"/>
           <wp:positionH relativeFrom="column">
             <wp:align>left</wp:align>
@@ -4189,6 +4272,7 @@
                   <a:prstGeom prst="rect">
                     <a:avLst/>
                   </a:prstGeom>
+                  <a:noFill/>
                 </pic:spPr>
               </pic:pic>
             </a:graphicData>
@@ -4201,7 +4285,7 @@
 </file>
 
 <file path=word/header3.xml><?xml version="1.0" encoding="utf-8"?>
-<w:hdr xmlns:o="urn:schemas-microsoft-com:office:office" xmlns:r="http://schemas.openxmlformats.org/officeDocument/2006/relationships" xmlns:v="urn:schemas-microsoft-com:vml" xmlns:w="http://schemas.openxmlformats.org/wordprocessingml/2006/main" xmlns:w10="urn:schemas-microsoft-com:office:word" xmlns:wp="http://schemas.openxmlformats.org/drawingml/2006/wordprocessingDrawing" xmlns:wps="http://schemas.microsoft.com/office/word/2010/wordprocessingShape" xmlns:wpg="http://schemas.microsoft.com/office/word/2010/wordprocessingGroup" xmlns:mc="http://schemas.openxmlformats.org/markup-compatibility/2006" xmlns:wp14="http://schemas.microsoft.com/office/word/2010/wordprocessingDrawing" xmlns:w14="http://schemas.microsoft.com/office/word/2010/wordml" xmlns:w15="http://schemas.microsoft.com/office/word/2012/wordml" mc:Ignorable="w14 wp14 w15">
+<w:hdr xmlns:o="urn:schemas-microsoft-com:office:office" xmlns:r="http://schemas.openxmlformats.org/officeDocument/2006/relationships" xmlns:v="urn:schemas-microsoft-com:vml" xmlns:w="http://schemas.openxmlformats.org/wordprocessingml/2006/main" xmlns:w10="urn:schemas-microsoft-com:office:word" xmlns:wp="http://schemas.openxmlformats.org/drawingml/2006/wordprocessingDrawing" xmlns:pic="http://schemas.openxmlformats.org/drawingml/2006/picture" xmlns:wps="http://schemas.microsoft.com/office/word/2010/wordprocessingShape" xmlns:wpg="http://schemas.microsoft.com/office/word/2010/wordprocessingGroup" xmlns:mc="http://schemas.openxmlformats.org/markup-compatibility/2006" xmlns:wp14="http://schemas.microsoft.com/office/word/2010/wordprocessingDrawing" xmlns:w14="http://schemas.microsoft.com/office/word/2010/wordml" xmlns:w15="http://schemas.microsoft.com/office/word/2012/wordml" mc:Ignorable="w14 wp14 w15">
   <w:p>
     <w:pPr>
       <w:pStyle w:val="Header"/>
@@ -4215,7 +4299,7 @@
     <w:r>
       <w:rPr/>
       <w:drawing>
-        <wp:anchor behindDoc="1" distT="0" distB="0" distL="0" distR="0" simplePos="0" locked="0" layoutInCell="0" allowOverlap="1" relativeHeight="14">
+        <wp:anchor behindDoc="1" distT="0" distB="0" distL="0" distR="0" simplePos="0" locked="0" layoutInCell="0" allowOverlap="1" relativeHeight="15">
           <wp:simplePos x="0" y="0"/>
           <wp:positionH relativeFrom="column">
             <wp:align>left</wp:align>
@@ -4253,6 +4337,7 @@
                   <a:prstGeom prst="rect">
                     <a:avLst/>
                   </a:prstGeom>
+                  <a:noFill/>
                 </pic:spPr>
               </pic:pic>
             </a:graphicData>
@@ -4279,6 +4364,7 @@
         </w:tabs>
         <w:ind w:left="0" w:hanging="0"/>
       </w:pPr>
+      <w:rPr/>
     </w:lvl>
     <w:lvl w:ilvl="1">
       <w:start w:val="1"/>
@@ -4292,6 +4378,7 @@
         </w:tabs>
         <w:ind w:left="0" w:hanging="0"/>
       </w:pPr>
+      <w:rPr/>
     </w:lvl>
     <w:lvl w:ilvl="2">
       <w:start w:val="1"/>
@@ -4305,6 +4392,7 @@
         </w:tabs>
         <w:ind w:left="0" w:hanging="0"/>
       </w:pPr>
+      <w:rPr/>
     </w:lvl>
     <w:lvl w:ilvl="3">
       <w:start w:val="1"/>
@@ -4318,6 +4406,7 @@
         </w:tabs>
         <w:ind w:left="0" w:hanging="0"/>
       </w:pPr>
+      <w:rPr/>
     </w:lvl>
     <w:lvl w:ilvl="4">
       <w:start w:val="1"/>
@@ -4331,6 +4420,7 @@
         </w:tabs>
         <w:ind w:left="0" w:hanging="0"/>
       </w:pPr>
+      <w:rPr/>
     </w:lvl>
     <w:lvl w:ilvl="5">
       <w:start w:val="1"/>
@@ -4344,6 +4434,7 @@
         </w:tabs>
         <w:ind w:left="0" w:hanging="0"/>
       </w:pPr>
+      <w:rPr/>
     </w:lvl>
     <w:lvl w:ilvl="6">
       <w:start w:val="1"/>
@@ -4357,6 +4448,7 @@
         </w:tabs>
         <w:ind w:left="0" w:hanging="0"/>
       </w:pPr>
+      <w:rPr/>
     </w:lvl>
     <w:lvl w:ilvl="7">
       <w:start w:val="1"/>
@@ -4370,6 +4462,7 @@
         </w:tabs>
         <w:ind w:left="0" w:hanging="0"/>
       </w:pPr>
+      <w:rPr/>
     </w:lvl>
     <w:lvl w:ilvl="8">
       <w:start w:val="1"/>
@@ -4383,6 +4476,7 @@
         </w:tabs>
         <w:ind w:left="0" w:hanging="0"/>
       </w:pPr>
+      <w:rPr/>
     </w:lvl>
   </w:abstractNum>
   <w:abstractNum w:abstractNumId="2">
@@ -4782,7 +4876,6 @@
         </w:tabs>
         <w:ind w:left="0" w:hanging="0"/>
       </w:pPr>
-      <w:rPr/>
     </w:lvl>
     <w:lvl w:ilvl="1">
       <w:start w:val="1"/>
@@ -4796,7 +4889,6 @@
         </w:tabs>
         <w:ind w:left="0" w:hanging="0"/>
       </w:pPr>
-      <w:rPr/>
     </w:lvl>
     <w:lvl w:ilvl="2">
       <w:start w:val="1"/>
@@ -4810,7 +4902,6 @@
         </w:tabs>
         <w:ind w:left="0" w:hanging="0"/>
       </w:pPr>
-      <w:rPr/>
     </w:lvl>
     <w:lvl w:ilvl="3">
       <w:start w:val="1"/>
@@ -4824,7 +4915,6 @@
         </w:tabs>
         <w:ind w:left="0" w:hanging="0"/>
       </w:pPr>
-      <w:rPr/>
     </w:lvl>
     <w:lvl w:ilvl="4">
       <w:start w:val="1"/>
@@ -4838,7 +4928,6 @@
         </w:tabs>
         <w:ind w:left="0" w:hanging="0"/>
       </w:pPr>
-      <w:rPr/>
     </w:lvl>
     <w:lvl w:ilvl="5">
       <w:start w:val="1"/>
@@ -4852,7 +4941,6 @@
         </w:tabs>
         <w:ind w:left="0" w:hanging="0"/>
       </w:pPr>
-      <w:rPr/>
     </w:lvl>
     <w:lvl w:ilvl="6">
       <w:start w:val="1"/>
@@ -4866,7 +4954,6 @@
         </w:tabs>
         <w:ind w:left="0" w:hanging="0"/>
       </w:pPr>
-      <w:rPr/>
     </w:lvl>
     <w:lvl w:ilvl="7">
       <w:start w:val="1"/>
@@ -4880,7 +4967,6 @@
         </w:tabs>
         <w:ind w:left="0" w:hanging="0"/>
       </w:pPr>
-      <w:rPr/>
     </w:lvl>
     <w:lvl w:ilvl="8">
       <w:start w:val="1"/>
@@ -4894,7 +4980,6 @@
         </w:tabs>
         <w:ind w:left="0" w:hanging="0"/>
       </w:pPr>
-      <w:rPr/>
     </w:lvl>
   </w:abstractNum>
   <w:num w:numId="1">
@@ -4953,14 +5038,14 @@
     </w:rPr>
   </w:style>
   <w:style w:type="paragraph" w:styleId="Heading1">
-    <w:name w:val="Heading 1"/>
-    <w:basedOn w:val="Heading"/>
+    <w:name w:val="heading 1"/>
+    <w:basedOn w:val="berschriftuser"/>
     <w:next w:val="BodyText"/>
     <w:qFormat/>
     <w:pPr>
       <w:numPr>
         <w:ilvl w:val="0"/>
-        <w:numId w:val="4"/>
+        <w:numId w:val="3"/>
       </w:numPr>
       <w:spacing w:before="1440" w:after="720"/>
       <w:outlineLvl w:val="0"/>
@@ -4973,14 +5058,14 @@
     </w:rPr>
   </w:style>
   <w:style w:type="paragraph" w:styleId="Heading2">
-    <w:name w:val="Heading 2"/>
-    <w:basedOn w:val="Heading"/>
+    <w:name w:val="heading 2"/>
+    <w:basedOn w:val="berschriftuser"/>
     <w:next w:val="BodyText"/>
     <w:qFormat/>
     <w:pPr>
       <w:numPr>
         <w:ilvl w:val="1"/>
-        <w:numId w:val="2"/>
+        <w:numId w:val="1"/>
       </w:numPr>
       <w:spacing w:before="283" w:after="283"/>
       <w:outlineLvl w:val="1"/>
@@ -4993,14 +5078,14 @@
     </w:rPr>
   </w:style>
   <w:style w:type="paragraph" w:styleId="Heading3">
-    <w:name w:val="Heading 3"/>
-    <w:basedOn w:val="Heading"/>
+    <w:name w:val="heading 3"/>
+    <w:basedOn w:val="berschriftuser"/>
     <w:qFormat/>
     <w:pPr>
       <w:widowControl w:val="false"/>
       <w:numPr>
         <w:ilvl w:val="2"/>
-        <w:numId w:val="5"/>
+        <w:numId w:val="4"/>
       </w:numPr>
       <w:suppressAutoHyphens w:val="true"/>
       <w:spacing w:before="0" w:after="0"/>
@@ -5014,14 +5099,14 @@
     </w:rPr>
   </w:style>
   <w:style w:type="paragraph" w:styleId="Heading4">
-    <w:name w:val="Heading 4"/>
-    <w:basedOn w:val="Heading"/>
+    <w:name w:val="heading 4"/>
+    <w:basedOn w:val="berschriftuser"/>
     <w:next w:val="BodyText"/>
     <w:qFormat/>
     <w:pPr>
       <w:numPr>
         <w:ilvl w:val="3"/>
-        <w:numId w:val="3"/>
+        <w:numId w:val="2"/>
       </w:numPr>
       <w:spacing w:before="120" w:after="120"/>
       <w:outlineLvl w:val="3"/>
@@ -5035,8 +5120,8 @@
       <w:szCs w:val="26"/>
     </w:rPr>
   </w:style>
-  <w:style w:type="paragraph" w:styleId="Heading">
-    <w:name w:val="Heading"/>
+  <w:style w:type="paragraph" w:styleId="berschrift">
+    <w:name w:val="Überschrift"/>
     <w:basedOn w:val="Normal"/>
     <w:next w:val="BodyText"/>
     <w:qFormat/>
@@ -5045,8 +5130,7 @@
       <w:spacing w:before="240" w:after="120"/>
     </w:pPr>
     <w:rPr>
-      <w:rFonts w:ascii="Arial" w:hAnsi="Arial" w:eastAsia="Noto Sans CJK SC" w:cs="Lohit Devanagari"/>
-      <w:b/>
+      <w:rFonts w:ascii="Liberation Sans" w:hAnsi="Liberation Sans" w:eastAsia="Noto Sans CJK SC" w:cs="Noto Sans Devanagari"/>
       <w:sz w:val="28"/>
       <w:szCs w:val="28"/>
     </w:rPr>
@@ -5068,7 +5152,7 @@
     </w:rPr>
   </w:style>
   <w:style w:type="paragraph" w:styleId="Caption">
-    <w:name w:val="Caption"/>
+    <w:name w:val="caption"/>
     <w:basedOn w:val="Normal"/>
     <w:qFormat/>
     <w:pPr>
@@ -5083,8 +5167,35 @@
       <w:szCs w:val="24"/>
     </w:rPr>
   </w:style>
-  <w:style w:type="paragraph" w:styleId="Index">
-    <w:name w:val="Index"/>
+  <w:style w:type="paragraph" w:styleId="Verzeichnis">
+    <w:name w:val="Verzeichnis"/>
+    <w:basedOn w:val="Normal"/>
+    <w:qFormat/>
+    <w:pPr>
+      <w:suppressLineNumbers/>
+    </w:pPr>
+    <w:rPr>
+      <w:rFonts w:cs="Noto Sans Devanagari"/>
+    </w:rPr>
+  </w:style>
+  <w:style w:type="paragraph" w:styleId="berschriftuser">
+    <w:name w:val="Überschrift (user)"/>
+    <w:basedOn w:val="Normal"/>
+    <w:next w:val="BodyText"/>
+    <w:qFormat/>
+    <w:pPr>
+      <w:keepNext w:val="true"/>
+      <w:spacing w:before="240" w:after="120"/>
+    </w:pPr>
+    <w:rPr>
+      <w:rFonts w:ascii="Arial" w:hAnsi="Arial" w:eastAsia="Noto Sans CJK SC" w:cs="Lohit Devanagari"/>
+      <w:b/>
+      <w:sz w:val="28"/>
+      <w:szCs w:val="28"/>
+    </w:rPr>
+  </w:style>
+  <w:style w:type="paragraph" w:styleId="Verzeichnisuser">
+    <w:name w:val="Verzeichnis (user)"/>
     <w:basedOn w:val="Normal"/>
     <w:qFormat/>
     <w:pPr>
@@ -5094,8 +5205,8 @@
       <w:rFonts w:cs="Lohit Devanagari"/>
     </w:rPr>
   </w:style>
-  <w:style w:type="paragraph" w:styleId="ListContents">
-    <w:name w:val="List Contents"/>
+  <w:style w:type="paragraph" w:styleId="Listeninhaltuser">
+    <w:name w:val="Listeninhalt (user)"/>
     <w:basedOn w:val="Normal"/>
     <w:qFormat/>
     <w:pPr>
@@ -5103,10 +5214,10 @@
     </w:pPr>
     <w:rPr/>
   </w:style>
-  <w:style w:type="paragraph" w:styleId="ListHeading">
-    <w:name w:val="List Heading"/>
+  <w:style w:type="paragraph" w:styleId="Listenkopfuser">
+    <w:name w:val="Listenkopf (user)"/>
     <w:basedOn w:val="Normal"/>
-    <w:next w:val="ListContents"/>
+    <w:next w:val="Listeninhaltuser"/>
     <w:qFormat/>
     <w:pPr>
       <w:ind w:hanging="0"/>
@@ -5124,7 +5235,7 @@
     <w:rPr/>
   </w:style>
   <w:style w:type="paragraph" w:styleId="EnvelopeReturn">
-    <w:name w:val="Envelope Return"/>
+    <w:name w:val="envelope return"/>
     <w:basedOn w:val="Normal"/>
     <w:qFormat/>
     <w:pPr>
@@ -5133,8 +5244,8 @@
     </w:pPr>
     <w:rPr/>
   </w:style>
-  <w:style w:type="paragraph" w:styleId="TableContents">
-    <w:name w:val="Table Contents"/>
+  <w:style w:type="paragraph" w:styleId="Tabelleninhaltuser">
+    <w:name w:val="Tabelleninhalt (user)"/>
     <w:basedOn w:val="Normal"/>
     <w:qFormat/>
     <w:pPr>
@@ -5145,7 +5256,7 @@
   </w:style>
   <w:style w:type="paragraph" w:styleId="Subtitle">
     <w:name w:val="Subtitle"/>
-    <w:basedOn w:val="Heading"/>
+    <w:basedOn w:val="berschriftuser"/>
     <w:next w:val="BodyText"/>
     <w:qFormat/>
     <w:pPr>
@@ -5162,7 +5273,7 @@
   </w:style>
   <w:style w:type="paragraph" w:styleId="Title">
     <w:name w:val="Title"/>
-    <w:basedOn w:val="Heading"/>
+    <w:basedOn w:val="berschriftuser"/>
     <w:next w:val="BodyText"/>
     <w:qFormat/>
     <w:pPr>
@@ -5176,9 +5287,9 @@
       <w:szCs w:val="56"/>
     </w:rPr>
   </w:style>
-  <w:style w:type="paragraph" w:styleId="TableHeading">
-    <w:name w:val="Table Heading"/>
-    <w:basedOn w:val="TableContents"/>
+  <w:style w:type="paragraph" w:styleId="Tabellenberschriftuser">
+    <w:name w:val="Tabellenüberschrift (user)"/>
+    <w:basedOn w:val="Tabelleninhaltuser"/>
     <w:qFormat/>
     <w:pPr>
       <w:suppressLineNumbers/>
@@ -5189,8 +5300,8 @@
       <w:bCs/>
     </w:rPr>
   </w:style>
-  <w:style w:type="paragraph" w:styleId="HeaderandFooter">
-    <w:name w:val="Header and Footer"/>
+  <w:style w:type="paragraph" w:styleId="Kopf-Fuzeileuser">
+    <w:name w:val="Kopf-/Fußzeile (user)"/>
     <w:basedOn w:val="Normal"/>
     <w:qFormat/>
     <w:pPr>
@@ -5203,17 +5314,24 @@
     </w:pPr>
     <w:rPr/>
   </w:style>
+  <w:style w:type="paragraph" w:styleId="Kopf-Fuzeile">
+    <w:name w:val="Kopf-/Fußzeile"/>
+    <w:basedOn w:val="Normal"/>
+    <w:qFormat/>
+    <w:pPr/>
+    <w:rPr/>
+  </w:style>
   <w:style w:type="paragraph" w:styleId="Header">
-    <w:name w:val="Header"/>
-    <w:basedOn w:val="HeaderandFooter"/>
+    <w:name w:val="header"/>
+    <w:basedOn w:val="Kopf-Fuzeileuser"/>
     <w:pPr>
       <w:suppressLineNumbers/>
     </w:pPr>
     <w:rPr/>
   </w:style>
   <w:style w:type="paragraph" w:styleId="Footer">
-    <w:name w:val="Footer"/>
-    <w:basedOn w:val="HeaderandFooter"/>
+    <w:name w:val="footer"/>
+    <w:basedOn w:val="Kopf-Fuzeileuser"/>
     <w:pPr>
       <w:suppressLineNumbers/>
     </w:pPr>

</xml_diff>